<commit_message>
City Library System : Implement the Borrow Log and fix the issue / return book
</commit_message>
<xml_diff>
--- a/City-Library-Management-System.docx
+++ b/City-Library-Management-System.docx
@@ -354,91 +354,131 @@
           <w:tab w:val="left" w:pos="1462"/>
         </w:tabs>
         <w:ind w:left="1462" w:hanging="359"/>
-      </w:pPr>
-      <w:r>
+        <w:rPr>
+          <w:highlight w:val="lightGray"/>
+        </w:rPr>
+      </w:pPr>
+      <w:r>
+        <w:rPr>
+          <w:highlight w:val="lightGray"/>
+        </w:rPr>
         <w:t>Each</w:t>
       </w:r>
       <w:r>
         <w:rPr>
           <w:spacing w:val="-10"/>
-        </w:rPr>
-        <w:t xml:space="preserve"> </w:t>
-      </w:r>
-      <w:r>
+          <w:highlight w:val="lightGray"/>
+        </w:rPr>
+        <w:t xml:space="preserve"> </w:t>
+      </w:r>
+      <w:r>
+        <w:rPr>
+          <w:highlight w:val="lightGray"/>
+        </w:rPr>
         <w:t>book</w:t>
       </w:r>
       <w:r>
         <w:rPr>
           <w:spacing w:val="-8"/>
-        </w:rPr>
-        <w:t xml:space="preserve"> </w:t>
-      </w:r>
-      <w:r>
+          <w:highlight w:val="lightGray"/>
+        </w:rPr>
+        <w:t xml:space="preserve"> </w:t>
+      </w:r>
+      <w:r>
+        <w:rPr>
+          <w:highlight w:val="lightGray"/>
+        </w:rPr>
         <w:t>has:</w:t>
       </w:r>
       <w:r>
         <w:rPr>
           <w:spacing w:val="-10"/>
-        </w:rPr>
-        <w:t xml:space="preserve"> </w:t>
-      </w:r>
-      <w:r>
+          <w:highlight w:val="lightGray"/>
+        </w:rPr>
+        <w:t xml:space="preserve"> </w:t>
+      </w:r>
+      <w:r>
+        <w:rPr>
+          <w:highlight w:val="lightGray"/>
+        </w:rPr>
         <w:t>Book</w:t>
       </w:r>
       <w:r>
         <w:rPr>
           <w:spacing w:val="-8"/>
-        </w:rPr>
-        <w:t xml:space="preserve"> </w:t>
-      </w:r>
-      <w:r>
+          <w:highlight w:val="lightGray"/>
+        </w:rPr>
+        <w:t xml:space="preserve"> </w:t>
+      </w:r>
+      <w:r>
+        <w:rPr>
+          <w:highlight w:val="lightGray"/>
+        </w:rPr>
         <w:t>ID,</w:t>
       </w:r>
       <w:r>
         <w:rPr>
           <w:spacing w:val="-8"/>
-        </w:rPr>
-        <w:t xml:space="preserve"> </w:t>
-      </w:r>
-      <w:r>
+          <w:highlight w:val="lightGray"/>
+        </w:rPr>
+        <w:t xml:space="preserve"> </w:t>
+      </w:r>
+      <w:r>
+        <w:rPr>
+          <w:highlight w:val="lightGray"/>
+        </w:rPr>
         <w:t>Title,</w:t>
       </w:r>
       <w:r>
         <w:rPr>
           <w:spacing w:val="-9"/>
-        </w:rPr>
-        <w:t xml:space="preserve"> </w:t>
-      </w:r>
-      <w:r>
+          <w:highlight w:val="lightGray"/>
+        </w:rPr>
+        <w:t xml:space="preserve"> </w:t>
+      </w:r>
+      <w:r>
+        <w:rPr>
+          <w:highlight w:val="lightGray"/>
+        </w:rPr>
         <w:t>Author,</w:t>
       </w:r>
       <w:r>
         <w:rPr>
           <w:spacing w:val="-10"/>
-        </w:rPr>
-        <w:t xml:space="preserve"> </w:t>
-      </w:r>
-      <w:r>
+          <w:highlight w:val="lightGray"/>
+        </w:rPr>
+        <w:t xml:space="preserve"> </w:t>
+      </w:r>
+      <w:r>
+        <w:rPr>
+          <w:highlight w:val="lightGray"/>
+        </w:rPr>
         <w:t>Genre,</w:t>
       </w:r>
       <w:r>
         <w:rPr>
           <w:spacing w:val="-10"/>
-        </w:rPr>
-        <w:t xml:space="preserve"> </w:t>
-      </w:r>
-      <w:r>
+          <w:highlight w:val="lightGray"/>
+        </w:rPr>
+        <w:t xml:space="preserve"> </w:t>
+      </w:r>
+      <w:r>
+        <w:rPr>
+          <w:highlight w:val="lightGray"/>
+        </w:rPr>
         <w:t>Availability</w:t>
       </w:r>
       <w:r>
         <w:rPr>
           <w:spacing w:val="-8"/>
+          <w:highlight w:val="lightGray"/>
         </w:rPr>
         <w:t xml:space="preserve"> </w:t>
       </w:r>
       <w:r>
         <w:rPr>
           <w:spacing w:val="-2"/>
+          <w:highlight w:val="lightGray"/>
         </w:rPr>
         <w:t>(Available/Issued).</w:t>
       </w:r>
@@ -455,103 +495,150 @@
         </w:tabs>
         <w:spacing w:before="182" w:line="259" w:lineRule="auto"/>
         <w:ind w:right="982"/>
-      </w:pPr>
-      <w:r>
+        <w:rPr>
+          <w:highlight w:val="lightGray"/>
+        </w:rPr>
+      </w:pPr>
+      <w:r>
+        <w:rPr>
+          <w:highlight w:val="lightGray"/>
+        </w:rPr>
         <w:t>The</w:t>
       </w:r>
       <w:r>
         <w:rPr>
           <w:spacing w:val="-6"/>
-        </w:rPr>
-        <w:t xml:space="preserve"> </w:t>
-      </w:r>
-      <w:r>
+          <w:highlight w:val="lightGray"/>
+        </w:rPr>
+        <w:t xml:space="preserve"> </w:t>
+      </w:r>
+      <w:r>
+        <w:rPr>
+          <w:highlight w:val="lightGray"/>
+        </w:rPr>
         <w:t>system</w:t>
       </w:r>
       <w:r>
         <w:rPr>
           <w:spacing w:val="-6"/>
-        </w:rPr>
-        <w:t xml:space="preserve"> </w:t>
-      </w:r>
-      <w:r>
+          <w:highlight w:val="lightGray"/>
+        </w:rPr>
+        <w:t xml:space="preserve"> </w:t>
+      </w:r>
+      <w:r>
+        <w:rPr>
+          <w:highlight w:val="lightGray"/>
+        </w:rPr>
         <w:t>should</w:t>
       </w:r>
       <w:r>
         <w:rPr>
           <w:spacing w:val="-7"/>
-        </w:rPr>
-        <w:t xml:space="preserve"> </w:t>
-      </w:r>
-      <w:r>
+          <w:highlight w:val="lightGray"/>
+        </w:rPr>
+        <w:t xml:space="preserve"> </w:t>
+      </w:r>
+      <w:r>
+        <w:rPr>
+          <w:highlight w:val="lightGray"/>
+        </w:rPr>
         <w:t>allow</w:t>
       </w:r>
       <w:r>
         <w:rPr>
           <w:spacing w:val="-5"/>
-        </w:rPr>
-        <w:t xml:space="preserve"> </w:t>
-      </w:r>
-      <w:r>
+          <w:highlight w:val="lightGray"/>
+        </w:rPr>
+        <w:t xml:space="preserve"> </w:t>
+      </w:r>
+      <w:r>
+        <w:rPr>
+          <w:highlight w:val="lightGray"/>
+        </w:rPr>
         <w:t>adding</w:t>
       </w:r>
       <w:r>
         <w:rPr>
           <w:spacing w:val="-6"/>
-        </w:rPr>
-        <w:t xml:space="preserve"> </w:t>
-      </w:r>
-      <w:r>
+          <w:highlight w:val="lightGray"/>
+        </w:rPr>
+        <w:t xml:space="preserve"> </w:t>
+      </w:r>
+      <w:r>
+        <w:rPr>
+          <w:highlight w:val="lightGray"/>
+        </w:rPr>
         <w:t>new</w:t>
       </w:r>
       <w:r>
         <w:rPr>
           <w:spacing w:val="-5"/>
-        </w:rPr>
-        <w:t xml:space="preserve"> </w:t>
-      </w:r>
-      <w:r>
+          <w:highlight w:val="lightGray"/>
+        </w:rPr>
+        <w:t xml:space="preserve"> </w:t>
+      </w:r>
+      <w:r>
+        <w:rPr>
+          <w:highlight w:val="lightGray"/>
+        </w:rPr>
         <w:t>books</w:t>
       </w:r>
       <w:r>
         <w:rPr>
           <w:spacing w:val="-6"/>
-        </w:rPr>
-        <w:t xml:space="preserve"> </w:t>
-      </w:r>
-      <w:r>
+          <w:highlight w:val="lightGray"/>
+        </w:rPr>
+        <w:t xml:space="preserve"> </w:t>
+      </w:r>
+      <w:r>
+        <w:rPr>
+          <w:highlight w:val="lightGray"/>
+        </w:rPr>
         <w:t>and</w:t>
       </w:r>
       <w:r>
         <w:rPr>
           <w:spacing w:val="-7"/>
-        </w:rPr>
-        <w:t xml:space="preserve"> </w:t>
-      </w:r>
-      <w:r>
+          <w:highlight w:val="lightGray"/>
+        </w:rPr>
+        <w:t xml:space="preserve"> </w:t>
+      </w:r>
+      <w:r>
+        <w:rPr>
+          <w:highlight w:val="lightGray"/>
+        </w:rPr>
         <w:t>updating</w:t>
       </w:r>
       <w:r>
         <w:rPr>
           <w:spacing w:val="-6"/>
-        </w:rPr>
-        <w:t xml:space="preserve"> </w:t>
-      </w:r>
-      <w:r>
+          <w:highlight w:val="lightGray"/>
+        </w:rPr>
+        <w:t xml:space="preserve"> </w:t>
+      </w:r>
+      <w:r>
+        <w:rPr>
+          <w:highlight w:val="lightGray"/>
+        </w:rPr>
         <w:t>availability</w:t>
       </w:r>
       <w:r>
         <w:rPr>
           <w:spacing w:val="-7"/>
-        </w:rPr>
-        <w:t xml:space="preserve"> </w:t>
-      </w:r>
-      <w:r>
+          <w:highlight w:val="lightGray"/>
+        </w:rPr>
+        <w:t xml:space="preserve"> </w:t>
+      </w:r>
+      <w:r>
+        <w:rPr>
+          <w:highlight w:val="lightGray"/>
+        </w:rPr>
         <w:t xml:space="preserve">when </w:t>
       </w:r>
       <w:r>
         <w:rPr>
           <w:spacing w:val="-2"/>
+          <w:highlight w:val="lightGray"/>
         </w:rPr>
         <w:t>issued/returned.</w:t>
       </w:r>
@@ -598,82 +685,121 @@
         <w:ind w:left="1462" w:hanging="359"/>
       </w:pPr>
       <w:r>
+        <w:rPr>
+          <w:highlight w:val="lightGray"/>
+        </w:rPr>
         <w:t>Each</w:t>
       </w:r>
       <w:r>
         <w:rPr>
           <w:spacing w:val="-6"/>
-        </w:rPr>
-        <w:t xml:space="preserve"> </w:t>
-      </w:r>
-      <w:r>
+          <w:highlight w:val="lightGray"/>
+        </w:rPr>
+        <w:t xml:space="preserve"> </w:t>
+      </w:r>
+      <w:r>
+        <w:rPr>
+          <w:highlight w:val="lightGray"/>
+        </w:rPr>
         <w:t>member</w:t>
       </w:r>
       <w:r>
         <w:rPr>
           <w:spacing w:val="-5"/>
-        </w:rPr>
-        <w:t xml:space="preserve"> </w:t>
-      </w:r>
-      <w:r>
+          <w:highlight w:val="lightGray"/>
+        </w:rPr>
+        <w:t xml:space="preserve"> </w:t>
+      </w:r>
+      <w:r>
+        <w:rPr>
+          <w:highlight w:val="lightGray"/>
+        </w:rPr>
         <w:t>has:</w:t>
       </w:r>
       <w:r>
         <w:rPr>
           <w:spacing w:val="-7"/>
-        </w:rPr>
-        <w:t xml:space="preserve"> </w:t>
-      </w:r>
-      <w:r>
+          <w:highlight w:val="lightGray"/>
+        </w:rPr>
+        <w:t xml:space="preserve"> </w:t>
+      </w:r>
+      <w:r>
+        <w:rPr>
+          <w:highlight w:val="lightGray"/>
+        </w:rPr>
         <w:t>Member</w:t>
       </w:r>
       <w:r>
         <w:rPr>
           <w:spacing w:val="-5"/>
-        </w:rPr>
-        <w:t xml:space="preserve"> </w:t>
-      </w:r>
-      <w:r>
+          <w:highlight w:val="lightGray"/>
+        </w:rPr>
+        <w:t xml:space="preserve"> </w:t>
+      </w:r>
+      <w:r>
+        <w:rPr>
+          <w:highlight w:val="lightGray"/>
+        </w:rPr>
         <w:t>ID,</w:t>
       </w:r>
       <w:r>
         <w:rPr>
           <w:spacing w:val="-5"/>
-        </w:rPr>
-        <w:t xml:space="preserve"> </w:t>
-      </w:r>
-      <w:r>
+          <w:highlight w:val="lightGray"/>
+        </w:rPr>
+        <w:t xml:space="preserve"> </w:t>
+      </w:r>
+      <w:r>
+        <w:rPr>
+          <w:highlight w:val="lightGray"/>
+        </w:rPr>
         <w:t>Name,</w:t>
       </w:r>
       <w:r>
         <w:rPr>
           <w:spacing w:val="-5"/>
-        </w:rPr>
-        <w:t xml:space="preserve"> </w:t>
-      </w:r>
-      <w:r>
+          <w:highlight w:val="lightGray"/>
+        </w:rPr>
+        <w:t xml:space="preserve"> </w:t>
+      </w:r>
+      <w:r>
+        <w:rPr>
+          <w:highlight w:val="lightGray"/>
+        </w:rPr>
         <w:t>Age,</w:t>
       </w:r>
       <w:r>
         <w:rPr>
           <w:spacing w:val="-6"/>
-        </w:rPr>
-        <w:t xml:space="preserve"> </w:t>
-      </w:r>
-      <w:r>
+          <w:highlight w:val="lightGray"/>
+        </w:rPr>
+        <w:t xml:space="preserve"> </w:t>
+      </w:r>
+      <w:r>
+        <w:rPr>
+          <w:highlight w:val="lightGray"/>
+        </w:rPr>
         <w:t>Contact</w:t>
       </w:r>
       <w:r>
         <w:rPr>
           <w:spacing w:val="-4"/>
+          <w:highlight w:val="lightGray"/>
         </w:rPr>
         <w:t xml:space="preserve"> </w:t>
       </w:r>
       <w:r>
         <w:rPr>
           <w:spacing w:val="-2"/>
-        </w:rPr>
-        <w:t>Info.</w:t>
+          <w:highlight w:val="lightGray"/>
+        </w:rPr>
+        <w:t>Info</w:t>
+      </w:r>
+      <w:r>
+        <w:rPr>
+          <w:spacing w:val="-2"/>
+        </w:rPr>
+        <w:t>.</w:t>
       </w:r>
     </w:p>
     <w:p>
@@ -863,55 +989,79 @@
         </w:tabs>
         <w:spacing w:before="183"/>
         <w:ind w:left="1462" w:hanging="359"/>
-      </w:pPr>
-      <w:r>
+        <w:rPr>
+          <w:highlight w:val="lightGray"/>
+        </w:rPr>
+      </w:pPr>
+      <w:r>
+        <w:rPr>
+          <w:highlight w:val="lightGray"/>
+        </w:rPr>
         <w:t>When</w:t>
       </w:r>
       <w:r>
         <w:rPr>
           <w:spacing w:val="-5"/>
-        </w:rPr>
-        <w:t xml:space="preserve"> </w:t>
-      </w:r>
-      <w:r>
+          <w:highlight w:val="lightGray"/>
+        </w:rPr>
+        <w:t xml:space="preserve"> </w:t>
+      </w:r>
+      <w:r>
+        <w:rPr>
+          <w:highlight w:val="lightGray"/>
+        </w:rPr>
         <w:t>a</w:t>
       </w:r>
       <w:r>
         <w:rPr>
           <w:spacing w:val="-4"/>
-        </w:rPr>
-        <w:t xml:space="preserve"> </w:t>
-      </w:r>
-      <w:r>
+          <w:highlight w:val="lightGray"/>
+        </w:rPr>
+        <w:t xml:space="preserve"> </w:t>
+      </w:r>
+      <w:r>
+        <w:rPr>
+          <w:highlight w:val="lightGray"/>
+        </w:rPr>
         <w:t>member</w:t>
       </w:r>
       <w:r>
         <w:rPr>
           <w:spacing w:val="-5"/>
-        </w:rPr>
-        <w:t xml:space="preserve"> </w:t>
-      </w:r>
-      <w:r>
+          <w:highlight w:val="lightGray"/>
+        </w:rPr>
+        <w:t xml:space="preserve"> </w:t>
+      </w:r>
+      <w:r>
+        <w:rPr>
+          <w:highlight w:val="lightGray"/>
+        </w:rPr>
         <w:t>borrows</w:t>
       </w:r>
       <w:r>
         <w:rPr>
           <w:spacing w:val="-4"/>
-        </w:rPr>
-        <w:t xml:space="preserve"> </w:t>
-      </w:r>
-      <w:r>
+          <w:highlight w:val="lightGray"/>
+        </w:rPr>
+        <w:t xml:space="preserve"> </w:t>
+      </w:r>
+      <w:r>
+        <w:rPr>
+          <w:highlight w:val="lightGray"/>
+        </w:rPr>
         <w:t>a</w:t>
       </w:r>
       <w:r>
         <w:rPr>
           <w:spacing w:val="-5"/>
+          <w:highlight w:val="lightGray"/>
         </w:rPr>
         <w:t xml:space="preserve"> </w:t>
       </w:r>
       <w:r>
         <w:rPr>
           <w:spacing w:val="-2"/>
+          <w:highlight w:val="lightGray"/>
         </w:rPr>
         <w:t>book:</w:t>
       </w:r>
@@ -927,28 +1077,40 @@
           <w:tab w:val="left" w:pos="2183"/>
         </w:tabs>
         <w:spacing w:before="179"/>
-      </w:pPr>
-      <w:r>
+        <w:rPr>
+          <w:highlight w:val="lightGray"/>
+        </w:rPr>
+      </w:pPr>
+      <w:r>
+        <w:rPr>
+          <w:highlight w:val="lightGray"/>
+        </w:rPr>
         <w:t>Update</w:t>
       </w:r>
       <w:r>
         <w:rPr>
           <w:spacing w:val="-6"/>
-        </w:rPr>
-        <w:t xml:space="preserve"> </w:t>
-      </w:r>
-      <w:r>
+          <w:highlight w:val="lightGray"/>
+        </w:rPr>
+        <w:t xml:space="preserve"> </w:t>
+      </w:r>
+      <w:r>
+        <w:rPr>
+          <w:highlight w:val="lightGray"/>
+        </w:rPr>
         <w:t>book</w:t>
       </w:r>
       <w:r>
         <w:rPr>
           <w:spacing w:val="-6"/>
+          <w:highlight w:val="lightGray"/>
         </w:rPr>
         <w:t xml:space="preserve"> </w:t>
       </w:r>
       <w:r>
         <w:rPr>
           <w:spacing w:val="-2"/>
+          <w:highlight w:val="lightGray"/>
         </w:rPr>
         <w:t>availability.</w:t>
       </w:r>
@@ -964,64 +1126,92 @@
           <w:tab w:val="left" w:pos="2183"/>
         </w:tabs>
         <w:spacing w:before="183"/>
-      </w:pPr>
-      <w:r>
+        <w:rPr>
+          <w:highlight w:val="lightGray"/>
+        </w:rPr>
+      </w:pPr>
+      <w:r>
+        <w:rPr>
+          <w:highlight w:val="lightGray"/>
+        </w:rPr>
         <w:t>Record</w:t>
       </w:r>
       <w:r>
         <w:rPr>
           <w:spacing w:val="-9"/>
-        </w:rPr>
-        <w:t xml:space="preserve"> </w:t>
-      </w:r>
-      <w:r>
+          <w:highlight w:val="lightGray"/>
+        </w:rPr>
+        <w:t xml:space="preserve"> </w:t>
+      </w:r>
+      <w:r>
+        <w:rPr>
+          <w:highlight w:val="lightGray"/>
+        </w:rPr>
         <w:t>the</w:t>
       </w:r>
       <w:r>
         <w:rPr>
           <w:spacing w:val="-6"/>
-        </w:rPr>
-        <w:t xml:space="preserve"> </w:t>
-      </w:r>
-      <w:r>
+          <w:highlight w:val="lightGray"/>
+        </w:rPr>
+        <w:t xml:space="preserve"> </w:t>
+      </w:r>
+      <w:r>
+        <w:rPr>
+          <w:highlight w:val="lightGray"/>
+        </w:rPr>
         <w:t>transaction</w:t>
       </w:r>
       <w:r>
         <w:rPr>
           <w:spacing w:val="-6"/>
-        </w:rPr>
-        <w:t xml:space="preserve"> </w:t>
-      </w:r>
-      <w:r>
+          <w:highlight w:val="lightGray"/>
+        </w:rPr>
+        <w:t xml:space="preserve"> </w:t>
+      </w:r>
+      <w:r>
+        <w:rPr>
+          <w:highlight w:val="lightGray"/>
+        </w:rPr>
         <w:t>in</w:t>
       </w:r>
       <w:r>
         <w:rPr>
           <w:spacing w:val="-9"/>
-        </w:rPr>
-        <w:t xml:space="preserve"> </w:t>
-      </w:r>
-      <w:r>
+          <w:highlight w:val="lightGray"/>
+        </w:rPr>
+        <w:t xml:space="preserve"> </w:t>
+      </w:r>
+      <w:r>
+        <w:rPr>
+          <w:highlight w:val="lightGray"/>
+        </w:rPr>
         <w:t>a</w:t>
       </w:r>
       <w:r>
         <w:rPr>
           <w:spacing w:val="-7"/>
-        </w:rPr>
-        <w:t xml:space="preserve"> </w:t>
-      </w:r>
-      <w:r>
+          <w:highlight w:val="lightGray"/>
+        </w:rPr>
+        <w:t xml:space="preserve"> </w:t>
+      </w:r>
+      <w:r>
+        <w:rPr>
+          <w:highlight w:val="lightGray"/>
+        </w:rPr>
         <w:t>borrow</w:t>
       </w:r>
       <w:r>
         <w:rPr>
           <w:spacing w:val="-5"/>
+          <w:highlight w:val="lightGray"/>
         </w:rPr>
         <w:t xml:space="preserve"> </w:t>
       </w:r>
       <w:r>
         <w:rPr>
           <w:spacing w:val="-4"/>
+          <w:highlight w:val="lightGray"/>
         </w:rPr>
         <w:t>log.</w:t>
       </w:r>
@@ -1037,46 +1227,66 @@
           <w:tab w:val="left" w:pos="1462"/>
         </w:tabs>
         <w:ind w:left="1462" w:hanging="359"/>
-      </w:pPr>
-      <w:r>
+        <w:rPr>
+          <w:highlight w:val="lightGray"/>
+        </w:rPr>
+      </w:pPr>
+      <w:r>
+        <w:rPr>
+          <w:highlight w:val="lightGray"/>
+        </w:rPr>
         <w:t>When</w:t>
       </w:r>
       <w:r>
         <w:rPr>
           <w:spacing w:val="-4"/>
-        </w:rPr>
-        <w:t xml:space="preserve"> </w:t>
-      </w:r>
-      <w:r>
+          <w:highlight w:val="lightGray"/>
+        </w:rPr>
+        <w:t xml:space="preserve"> </w:t>
+      </w:r>
+      <w:r>
+        <w:rPr>
+          <w:highlight w:val="lightGray"/>
+        </w:rPr>
         <w:t>a</w:t>
       </w:r>
       <w:r>
         <w:rPr>
           <w:spacing w:val="-2"/>
-        </w:rPr>
-        <w:t xml:space="preserve"> </w:t>
-      </w:r>
-      <w:r>
+          <w:highlight w:val="lightGray"/>
+        </w:rPr>
+        <w:t xml:space="preserve"> </w:t>
+      </w:r>
+      <w:r>
+        <w:rPr>
+          <w:highlight w:val="lightGray"/>
+        </w:rPr>
         <w:t>book</w:t>
       </w:r>
       <w:r>
         <w:rPr>
           <w:spacing w:val="-2"/>
-        </w:rPr>
-        <w:t xml:space="preserve"> </w:t>
-      </w:r>
-      <w:r>
+          <w:highlight w:val="lightGray"/>
+        </w:rPr>
+        <w:t xml:space="preserve"> </w:t>
+      </w:r>
+      <w:r>
+        <w:rPr>
+          <w:highlight w:val="lightGray"/>
+        </w:rPr>
         <w:t>is</w:t>
       </w:r>
       <w:r>
         <w:rPr>
           <w:spacing w:val="-5"/>
+          <w:highlight w:val="lightGray"/>
         </w:rPr>
         <w:t xml:space="preserve"> </w:t>
       </w:r>
       <w:r>
         <w:rPr>
           <w:spacing w:val="-2"/>
+          <w:highlight w:val="lightGray"/>
         </w:rPr>
         <w:t>returned:</w:t>
       </w:r>
@@ -1091,28 +1301,40 @@
         <w:tabs>
           <w:tab w:val="left" w:pos="2183"/>
         </w:tabs>
-      </w:pPr>
-      <w:r>
+        <w:rPr>
+          <w:highlight w:val="lightGray"/>
+        </w:rPr>
+      </w:pPr>
+      <w:r>
+        <w:rPr>
+          <w:highlight w:val="lightGray"/>
+        </w:rPr>
         <w:t>Update</w:t>
       </w:r>
       <w:r>
         <w:rPr>
           <w:spacing w:val="-11"/>
-        </w:rPr>
-        <w:t xml:space="preserve"> </w:t>
-      </w:r>
-      <w:r>
+          <w:highlight w:val="lightGray"/>
+        </w:rPr>
+        <w:t xml:space="preserve"> </w:t>
+      </w:r>
+      <w:r>
+        <w:rPr>
+          <w:highlight w:val="lightGray"/>
+        </w:rPr>
         <w:t>availability</w:t>
       </w:r>
       <w:r>
         <w:rPr>
           <w:spacing w:val="-11"/>
+          <w:highlight w:val="lightGray"/>
         </w:rPr>
         <w:t xml:space="preserve"> </w:t>
       </w:r>
       <w:r>
         <w:rPr>
           <w:spacing w:val="-2"/>
+          <w:highlight w:val="lightGray"/>
         </w:rPr>
         <w:t>again.</w:t>
       </w:r>
@@ -1165,73 +1387,105 @@
           <w:tab w:val="left" w:pos="1462"/>
         </w:tabs>
         <w:ind w:left="1462" w:hanging="359"/>
-      </w:pPr>
-      <w:r>
+        <w:rPr>
+          <w:highlight w:val="lightGray"/>
+        </w:rPr>
+      </w:pPr>
+      <w:r>
+        <w:rPr>
+          <w:highlight w:val="lightGray"/>
+        </w:rPr>
         <w:t>Show</w:t>
       </w:r>
       <w:r>
         <w:rPr>
           <w:spacing w:val="-3"/>
-        </w:rPr>
-        <w:t xml:space="preserve"> </w:t>
-      </w:r>
-      <w:r>
+          <w:highlight w:val="lightGray"/>
+        </w:rPr>
+        <w:t xml:space="preserve"> </w:t>
+      </w:r>
+      <w:r>
+        <w:rPr>
+          <w:highlight w:val="lightGray"/>
+        </w:rPr>
         <w:t>all</w:t>
       </w:r>
       <w:r>
         <w:rPr>
           <w:spacing w:val="-5"/>
-        </w:rPr>
-        <w:t xml:space="preserve"> </w:t>
-      </w:r>
-      <w:r>
+          <w:highlight w:val="lightGray"/>
+        </w:rPr>
+        <w:t xml:space="preserve"> </w:t>
+      </w:r>
+      <w:r>
+        <w:rPr>
+          <w:highlight w:val="lightGray"/>
+        </w:rPr>
         <w:t>available</w:t>
       </w:r>
       <w:r>
         <w:rPr>
           <w:spacing w:val="-4"/>
-        </w:rPr>
-        <w:t xml:space="preserve"> </w:t>
-      </w:r>
-      <w:r>
+          <w:highlight w:val="lightGray"/>
+        </w:rPr>
+        <w:t xml:space="preserve"> </w:t>
+      </w:r>
+      <w:r>
+        <w:rPr>
+          <w:highlight w:val="lightGray"/>
+        </w:rPr>
         <w:t>books</w:t>
       </w:r>
       <w:r>
         <w:rPr>
           <w:spacing w:val="-7"/>
-        </w:rPr>
-        <w:t xml:space="preserve"> </w:t>
-      </w:r>
-      <w:r>
+          <w:highlight w:val="lightGray"/>
+        </w:rPr>
+        <w:t xml:space="preserve"> </w:t>
+      </w:r>
+      <w:r>
+        <w:rPr>
+          <w:highlight w:val="lightGray"/>
+        </w:rPr>
         <w:t>in</w:t>
       </w:r>
       <w:r>
         <w:rPr>
           <w:spacing w:val="-6"/>
-        </w:rPr>
-        <w:t xml:space="preserve"> </w:t>
-      </w:r>
-      <w:r>
+          <w:highlight w:val="lightGray"/>
+        </w:rPr>
+        <w:t xml:space="preserve"> </w:t>
+      </w:r>
+      <w:r>
+        <w:rPr>
+          <w:highlight w:val="lightGray"/>
+        </w:rPr>
         <w:t>a</w:t>
       </w:r>
       <w:r>
         <w:rPr>
           <w:spacing w:val="-4"/>
-        </w:rPr>
-        <w:t xml:space="preserve"> </w:t>
-      </w:r>
-      <w:r>
+          <w:highlight w:val="lightGray"/>
+        </w:rPr>
+        <w:t xml:space="preserve"> </w:t>
+      </w:r>
+      <w:r>
+        <w:rPr>
+          <w:highlight w:val="lightGray"/>
+        </w:rPr>
         <w:t>given</w:t>
       </w:r>
       <w:r>
         <w:rPr>
           <w:spacing w:val="-6"/>
+          <w:highlight w:val="lightGray"/>
         </w:rPr>
         <w:t xml:space="preserve"> </w:t>
       </w:r>
       <w:r>
         <w:rPr>
           <w:spacing w:val="-2"/>
+          <w:highlight w:val="lightGray"/>
         </w:rPr>
         <w:t>genre.</w:t>
       </w:r>
@@ -1321,73 +1575,105 @@
           <w:tab w:val="left" w:pos="1462"/>
         </w:tabs>
         <w:ind w:left="1462" w:hanging="359"/>
-      </w:pPr>
-      <w:r>
+        <w:rPr>
+          <w:highlight w:val="lightGray"/>
+        </w:rPr>
+      </w:pPr>
+      <w:r>
+        <w:rPr>
+          <w:highlight w:val="lightGray"/>
+        </w:rPr>
         <w:t>Search</w:t>
       </w:r>
       <w:r>
         <w:rPr>
           <w:spacing w:val="-4"/>
-        </w:rPr>
-        <w:t xml:space="preserve"> </w:t>
-      </w:r>
-      <w:r>
+          <w:highlight w:val="lightGray"/>
+        </w:rPr>
+        <w:t xml:space="preserve"> </w:t>
+      </w:r>
+      <w:r>
+        <w:rPr>
+          <w:highlight w:val="lightGray"/>
+        </w:rPr>
         <w:t>for</w:t>
       </w:r>
       <w:r>
         <w:rPr>
           <w:spacing w:val="-4"/>
-        </w:rPr>
-        <w:t xml:space="preserve"> </w:t>
-      </w:r>
-      <w:r>
+          <w:highlight w:val="lightGray"/>
+        </w:rPr>
+        <w:t xml:space="preserve"> </w:t>
+      </w:r>
+      <w:r>
+        <w:rPr>
+          <w:highlight w:val="lightGray"/>
+        </w:rPr>
         <w:t>a</w:t>
       </w:r>
       <w:r>
         <w:rPr>
           <w:spacing w:val="-4"/>
-        </w:rPr>
-        <w:t xml:space="preserve"> </w:t>
-      </w:r>
-      <w:r>
+          <w:highlight w:val="lightGray"/>
+        </w:rPr>
+        <w:t xml:space="preserve"> </w:t>
+      </w:r>
+      <w:r>
+        <w:rPr>
+          <w:highlight w:val="lightGray"/>
+        </w:rPr>
         <w:t>book</w:t>
       </w:r>
       <w:r>
         <w:rPr>
           <w:spacing w:val="-4"/>
-        </w:rPr>
-        <w:t xml:space="preserve"> </w:t>
-      </w:r>
-      <w:r>
+          <w:highlight w:val="lightGray"/>
+        </w:rPr>
+        <w:t xml:space="preserve"> </w:t>
+      </w:r>
+      <w:r>
+        <w:rPr>
+          <w:highlight w:val="lightGray"/>
+        </w:rPr>
         <w:t>by</w:t>
       </w:r>
       <w:r>
         <w:rPr>
           <w:spacing w:val="-4"/>
-        </w:rPr>
-        <w:t xml:space="preserve"> </w:t>
-      </w:r>
-      <w:r>
+          <w:highlight w:val="lightGray"/>
+        </w:rPr>
+        <w:t xml:space="preserve"> </w:t>
+      </w:r>
+      <w:r>
+        <w:rPr>
+          <w:highlight w:val="lightGray"/>
+        </w:rPr>
         <w:t>title</w:t>
       </w:r>
       <w:r>
         <w:rPr>
           <w:spacing w:val="-5"/>
-        </w:rPr>
-        <w:t xml:space="preserve"> </w:t>
-      </w:r>
-      <w:r>
+          <w:highlight w:val="lightGray"/>
+        </w:rPr>
+        <w:t xml:space="preserve"> </w:t>
+      </w:r>
+      <w:r>
+        <w:rPr>
+          <w:highlight w:val="lightGray"/>
+        </w:rPr>
         <w:t>or</w:t>
       </w:r>
       <w:r>
         <w:rPr>
           <w:spacing w:val="-4"/>
+          <w:highlight w:val="lightGray"/>
         </w:rPr>
         <w:t xml:space="preserve"> </w:t>
       </w:r>
       <w:r>
         <w:rPr>
           <w:spacing w:val="-2"/>
+          <w:highlight w:val="lightGray"/>
         </w:rPr>
         <w:t>author.</w:t>
       </w:r>
@@ -1533,125 +1819,183 @@
         </w:tabs>
         <w:spacing w:line="259" w:lineRule="auto"/>
         <w:ind w:right="32"/>
-      </w:pPr>
-      <w:r>
+        <w:rPr>
+          <w:highlight w:val="lightGray"/>
+        </w:rPr>
+      </w:pPr>
+      <w:r>
+        <w:rPr>
+          <w:highlight w:val="lightGray"/>
+        </w:rPr>
         <w:t>The</w:t>
       </w:r>
       <w:r>
         <w:rPr>
           <w:spacing w:val="-6"/>
-        </w:rPr>
-        <w:t xml:space="preserve"> </w:t>
-      </w:r>
-      <w:r>
+          <w:highlight w:val="lightGray"/>
+        </w:rPr>
+        <w:t xml:space="preserve"> </w:t>
+      </w:r>
+      <w:r>
+        <w:rPr>
+          <w:highlight w:val="lightGray"/>
+        </w:rPr>
         <w:t>system</w:t>
       </w:r>
       <w:r>
         <w:rPr>
           <w:spacing w:val="-7"/>
-        </w:rPr>
-        <w:t xml:space="preserve"> </w:t>
-      </w:r>
-      <w:r>
+          <w:highlight w:val="lightGray"/>
+        </w:rPr>
+        <w:t xml:space="preserve"> </w:t>
+      </w:r>
+      <w:r>
+        <w:rPr>
+          <w:highlight w:val="lightGray"/>
+        </w:rPr>
         <w:t>should</w:t>
       </w:r>
       <w:r>
         <w:rPr>
           <w:spacing w:val="-8"/>
-        </w:rPr>
-        <w:t xml:space="preserve"> </w:t>
-      </w:r>
-      <w:r>
+          <w:highlight w:val="lightGray"/>
+        </w:rPr>
+        <w:t xml:space="preserve"> </w:t>
+      </w:r>
+      <w:r>
+        <w:rPr>
+          <w:highlight w:val="lightGray"/>
+        </w:rPr>
         <w:t>be</w:t>
       </w:r>
       <w:r>
         <w:rPr>
           <w:spacing w:val="-6"/>
-        </w:rPr>
-        <w:t xml:space="preserve"> </w:t>
-      </w:r>
-      <w:r>
+          <w:highlight w:val="lightGray"/>
+        </w:rPr>
+        <w:t xml:space="preserve"> </w:t>
+      </w:r>
+      <w:r>
+        <w:rPr>
+          <w:highlight w:val="lightGray"/>
+        </w:rPr>
         <w:t>broken</w:t>
       </w:r>
       <w:r>
         <w:rPr>
           <w:spacing w:val="-6"/>
-        </w:rPr>
-        <w:t xml:space="preserve"> </w:t>
-      </w:r>
-      <w:r>
+          <w:highlight w:val="lightGray"/>
+        </w:rPr>
+        <w:t xml:space="preserve"> </w:t>
+      </w:r>
+      <w:r>
+        <w:rPr>
+          <w:highlight w:val="lightGray"/>
+        </w:rPr>
         <w:t>into</w:t>
       </w:r>
       <w:r>
         <w:rPr>
           <w:spacing w:val="-7"/>
-        </w:rPr>
-        <w:t xml:space="preserve"> </w:t>
-      </w:r>
-      <w:r>
+          <w:highlight w:val="lightGray"/>
+        </w:rPr>
+        <w:t xml:space="preserve"> </w:t>
+      </w:r>
+      <w:r>
+        <w:rPr>
+          <w:highlight w:val="lightGray"/>
+        </w:rPr>
         <w:t>reusable</w:t>
       </w:r>
       <w:r>
         <w:rPr>
           <w:spacing w:val="-6"/>
-        </w:rPr>
-        <w:t xml:space="preserve"> </w:t>
-      </w:r>
-      <w:r>
+          <w:highlight w:val="lightGray"/>
+        </w:rPr>
+        <w:t xml:space="preserve"> </w:t>
+      </w:r>
+      <w:r>
+        <w:rPr>
+          <w:highlight w:val="lightGray"/>
+        </w:rPr>
         <w:t>parts</w:t>
       </w:r>
       <w:r>
         <w:rPr>
           <w:spacing w:val="-5"/>
-        </w:rPr>
-        <w:t xml:space="preserve"> </w:t>
-      </w:r>
-      <w:r>
+          <w:highlight w:val="lightGray"/>
+        </w:rPr>
+        <w:t xml:space="preserve"> </w:t>
+      </w:r>
+      <w:r>
+        <w:rPr>
+          <w:highlight w:val="lightGray"/>
+        </w:rPr>
         <w:t>(for</w:t>
       </w:r>
       <w:r>
         <w:rPr>
           <w:spacing w:val="-8"/>
-        </w:rPr>
-        <w:t xml:space="preserve"> </w:t>
-      </w:r>
-      <w:r>
+          <w:highlight w:val="lightGray"/>
+        </w:rPr>
+        <w:t xml:space="preserve"> </w:t>
+      </w:r>
+      <w:r>
+        <w:rPr>
+          <w:highlight w:val="lightGray"/>
+        </w:rPr>
         <w:t>example:</w:t>
       </w:r>
       <w:r>
         <w:rPr>
           <w:spacing w:val="-6"/>
-        </w:rPr>
-        <w:t xml:space="preserve"> </w:t>
-      </w:r>
-      <w:r>
+          <w:highlight w:val="lightGray"/>
+        </w:rPr>
+        <w:t xml:space="preserve"> </w:t>
+      </w:r>
+      <w:r>
+        <w:rPr>
+          <w:highlight w:val="lightGray"/>
+        </w:rPr>
         <w:t>adding</w:t>
       </w:r>
       <w:r>
         <w:rPr>
           <w:spacing w:val="-7"/>
-        </w:rPr>
-        <w:t xml:space="preserve"> </w:t>
-      </w:r>
-      <w:r>
+          <w:highlight w:val="lightGray"/>
+        </w:rPr>
+        <w:t xml:space="preserve"> </w:t>
+      </w:r>
+      <w:r>
+        <w:rPr>
+          <w:highlight w:val="lightGray"/>
+        </w:rPr>
         <w:t>a</w:t>
       </w:r>
       <w:r>
         <w:rPr>
           <w:spacing w:val="-6"/>
-        </w:rPr>
-        <w:t xml:space="preserve"> </w:t>
-      </w:r>
-      <w:r>
+          <w:highlight w:val="lightGray"/>
+        </w:rPr>
+        <w:t xml:space="preserve"> </w:t>
+      </w:r>
+      <w:r>
+        <w:rPr>
+          <w:highlight w:val="lightGray"/>
+        </w:rPr>
         <w:t>book,</w:t>
       </w:r>
       <w:r>
         <w:rPr>
           <w:spacing w:val="-6"/>
-        </w:rPr>
-        <w:t xml:space="preserve"> </w:t>
-      </w:r>
-      <w:r>
+          <w:highlight w:val="lightGray"/>
+        </w:rPr>
+        <w:t xml:space="preserve"> </w:t>
+      </w:r>
+      <w:r>
+        <w:rPr>
+          <w:highlight w:val="lightGray"/>
+        </w:rPr>
         <w:t>issuing a book, searching, etc.).</w:t>
       </w:r>
     </w:p>
@@ -1669,98 +2013,139 @@
         <w:ind w:left="1462" w:hanging="359"/>
       </w:pPr>
       <w:r>
+        <w:rPr>
+          <w:highlight w:val="lightGray"/>
+        </w:rPr>
         <w:t>Include</w:t>
       </w:r>
       <w:r>
         <w:rPr>
           <w:spacing w:val="-5"/>
-        </w:rPr>
-        <w:t xml:space="preserve"> </w:t>
-      </w:r>
-      <w:r>
+          <w:highlight w:val="lightGray"/>
+        </w:rPr>
+        <w:t xml:space="preserve"> </w:t>
+      </w:r>
+      <w:r>
+        <w:rPr>
+          <w:highlight w:val="lightGray"/>
+        </w:rPr>
         <w:t>clear</w:t>
       </w:r>
       <w:r>
         <w:rPr>
           <w:spacing w:val="-5"/>
-        </w:rPr>
-        <w:t xml:space="preserve"> </w:t>
-      </w:r>
-      <w:r>
+          <w:highlight w:val="lightGray"/>
+        </w:rPr>
+        <w:t xml:space="preserve"> </w:t>
+      </w:r>
+      <w:r>
+        <w:rPr>
+          <w:highlight w:val="lightGray"/>
+        </w:rPr>
         <w:t>conditions</w:t>
       </w:r>
       <w:r>
         <w:rPr>
           <w:spacing w:val="-6"/>
-        </w:rPr>
-        <w:t xml:space="preserve"> </w:t>
-      </w:r>
-      <w:r>
+          <w:highlight w:val="lightGray"/>
+        </w:rPr>
+        <w:t xml:space="preserve"> </w:t>
+      </w:r>
+      <w:r>
+        <w:rPr>
+          <w:highlight w:val="lightGray"/>
+        </w:rPr>
         <w:t>(e.g.,</w:t>
       </w:r>
       <w:r>
         <w:rPr>
           <w:spacing w:val="-5"/>
-        </w:rPr>
-        <w:t xml:space="preserve"> </w:t>
-      </w:r>
-      <w:r>
+          <w:highlight w:val="lightGray"/>
+        </w:rPr>
+        <w:t xml:space="preserve"> </w:t>
+      </w:r>
+      <w:r>
+        <w:rPr>
+          <w:highlight w:val="lightGray"/>
+        </w:rPr>
         <w:t>prevent</w:t>
       </w:r>
       <w:r>
         <w:rPr>
           <w:spacing w:val="-4"/>
-        </w:rPr>
-        <w:t xml:space="preserve"> </w:t>
-      </w:r>
-      <w:r>
+          <w:highlight w:val="lightGray"/>
+        </w:rPr>
+        <w:t xml:space="preserve"> </w:t>
+      </w:r>
+      <w:r>
+        <w:rPr>
+          <w:highlight w:val="lightGray"/>
+        </w:rPr>
         <w:t>issuing</w:t>
       </w:r>
       <w:r>
         <w:rPr>
           <w:spacing w:val="-6"/>
-        </w:rPr>
-        <w:t xml:space="preserve"> </w:t>
-      </w:r>
-      <w:r>
+          <w:highlight w:val="lightGray"/>
+        </w:rPr>
+        <w:t xml:space="preserve"> </w:t>
+      </w:r>
+      <w:r>
+        <w:rPr>
+          <w:highlight w:val="lightGray"/>
+        </w:rPr>
         <w:t>a</w:t>
       </w:r>
       <w:r>
         <w:rPr>
           <w:spacing w:val="-6"/>
-        </w:rPr>
-        <w:t xml:space="preserve"> </w:t>
-      </w:r>
-      <w:r>
+          <w:highlight w:val="lightGray"/>
+        </w:rPr>
+        <w:t xml:space="preserve"> </w:t>
+      </w:r>
+      <w:r>
+        <w:rPr>
+          <w:highlight w:val="lightGray"/>
+        </w:rPr>
         <w:t>book</w:t>
       </w:r>
       <w:r>
         <w:rPr>
           <w:spacing w:val="-5"/>
-        </w:rPr>
-        <w:t xml:space="preserve"> </w:t>
-      </w:r>
-      <w:r>
+          <w:highlight w:val="lightGray"/>
+        </w:rPr>
+        <w:t xml:space="preserve"> </w:t>
+      </w:r>
+      <w:r>
+        <w:rPr>
+          <w:highlight w:val="lightGray"/>
+        </w:rPr>
         <w:t>if</w:t>
       </w:r>
       <w:r>
         <w:rPr>
           <w:spacing w:val="-7"/>
-        </w:rPr>
-        <w:t xml:space="preserve"> </w:t>
-      </w:r>
-      <w:r>
+          <w:highlight w:val="lightGray"/>
+        </w:rPr>
+        <w:t xml:space="preserve"> </w:t>
+      </w:r>
+      <w:r>
+        <w:rPr>
+          <w:highlight w:val="lightGray"/>
+        </w:rPr>
         <w:t>already</w:t>
       </w:r>
       <w:r>
         <w:rPr>
           <w:spacing w:val="-6"/>
+          <w:highlight w:val="lightGray"/>
         </w:rPr>
         <w:t xml:space="preserve"> </w:t>
       </w:r>
       <w:r>
         <w:rPr>
           <w:spacing w:val="-2"/>
+          <w:highlight w:val="lightGray"/>
         </w:rPr>
         <w:t>borrowed).</w:t>
       </w:r>
@@ -1857,17 +2242,15 @@
           <w:tab w:val="left" w:pos="1462"/>
         </w:tabs>
         <w:spacing w:before="158"/>
-      </w:pPr>
-      <w:r>
-        <w:t xml:space="preserve">Add </w:t>
-      </w:r>
-      <w:proofErr w:type="spellStart"/>
-      <w:r>
-        <w:t>Sqlite</w:t>
-      </w:r>
-      <w:proofErr w:type="spellEnd"/>
-      <w:r>
-        <w:t xml:space="preserve"> Database along with Schemas</w:t>
+        <w:rPr>
+          <w:highlight w:val="lightGray"/>
+        </w:rPr>
+      </w:pPr>
+      <w:r>
+        <w:rPr>
+          <w:highlight w:val="lightGray"/>
+        </w:rPr>
+        <w:t>Borrow User Id should match return User Id</w:t>
       </w:r>
     </w:p>
     <w:p>
@@ -1882,9 +2265,6 @@
         </w:tabs>
         <w:spacing w:before="158"/>
       </w:pPr>
-      <w:r>
-        <w:t>Implement GUI.</w:t>
-      </w:r>
     </w:p>
     <w:p>
       <w:pPr>
@@ -1898,21 +2278,15 @@
         </w:tabs>
         <w:spacing w:before="158"/>
       </w:pPr>
-      <w:r>
-        <w:t>Implement HTTP Rest API Interface</w:t>
-      </w:r>
     </w:p>
     <w:p>
       <w:pPr>
         <w:pStyle w:val="ListParagraph"/>
-        <w:numPr>
-          <w:ilvl w:val="0"/>
-          <w:numId w:val="2"/>
-        </w:numPr>
         <w:tabs>
           <w:tab w:val="left" w:pos="1462"/>
         </w:tabs>
         <w:spacing w:before="158"/>
+        <w:ind w:left="720" w:firstLine="0"/>
       </w:pPr>
     </w:p>
     <w:sectPr>

</xml_diff>